<commit_message>
Add AR/AP money-flow strip and clarify finance step in section 1
https://claude.ai/code/session_01QzNXqs3AZVba53uzCJorjC
</commit_message>
<xml_diff>
--- a/Ledger_Build_vs_Buy.docx
+++ b/Ledger_Build_vs_Buy.docx
@@ -56,7 +56,7 @@
     </w:tbl>
     <w:p>
       <w:pPr>
-        <w:spacing w:before="200" w:after="80"/>
+        <w:spacing w:before="140" w:after="80"/>
         <w:pBdr>
           <w:bottom w:val="single" w:sz="8" w:color="E2E8F0"/>
         </w:pBdr>
@@ -77,6 +77,260 @@
           <w:sz w:val="22"/>
         </w:rPr>
         <w:t xml:space="preserve">  How money flows today (current process)</w:t>
+      </w:r>
+    </w:p>
+    <w:tbl>
+      <w:tblPr>
+        <w:tblW w:type="auto" w:w="0"/>
+        <w:jc w:val="center"/>
+        <w:tblLook w:firstColumn="1" w:firstRow="1" w:lastColumn="0" w:lastRow="0" w:noHBand="0" w:noVBand="1" w:val="04A0"/>
+        <w:tblBorders>
+          <w:top w:val="none"/>
+          <w:left w:val="none"/>
+          <w:bottom w:val="none"/>
+          <w:right w:val="none"/>
+          <w:insideH w:val="none"/>
+          <w:insideV w:val="none"/>
+        </w:tblBorders>
+      </w:tblPr>
+      <w:tblGrid>
+        <w:gridCol w:w="2109"/>
+        <w:gridCol w:w="2109"/>
+        <w:gridCol w:w="2109"/>
+        <w:gridCol w:w="2109"/>
+        <w:gridCol w:w="2109"/>
+      </w:tblGrid>
+      <w:tr>
+        <w:tc>
+          <w:tcPr>
+            <w:tcW w:type="dxa" w:w="2721"/>
+            <w:shd w:val="clear" w:fill="EAF2FB"/>
+            <w:tcBorders>
+              <w:top w:val="single" w:sz="8" w:color="6F9FD0"/>
+              <w:bottom w:val="single" w:sz="8" w:color="6F9FD0"/>
+              <w:left w:val="single" w:sz="8" w:color="6F9FD0"/>
+              <w:right w:val="single" w:sz="8" w:color="6F9FD0"/>
+            </w:tcBorders>
+            <w:vAlign w:val="center"/>
+          </w:tcPr>
+          <w:p>
+            <w:pPr>
+              <w:spacing w:before="40" w:after="40"/>
+              <w:jc w:val="center"/>
+            </w:pPr>
+            <w:r>
+              <w:rPr>
+                <w:b/>
+                <w:color w:val="1E293B"/>
+                <w:sz w:val="15"/>
+              </w:rPr>
+              <w:t>LSP (customer)</w:t>
+            </w:r>
+            <w:r>
+              <w:rPr>
+                <w:b w:val="0"/>
+                <w:color w:val="334155"/>
+                <w:sz w:val="15"/>
+              </w:rPr>
+            </w:r>
+          </w:p>
+          <w:p>
+            <w:pPr>
+              <w:spacing w:before="0" w:after="40"/>
+              <w:jc w:val="center"/>
+            </w:pPr>
+            <w:r>
+              <w:rPr>
+                <w:b w:val="0"/>
+                <w:color w:val="334155"/>
+                <w:sz w:val="15"/>
+              </w:rPr>
+              <w:t>Books the trip and owes us freight</w:t>
+            </w:r>
+          </w:p>
+        </w:tc>
+        <w:tc>
+          <w:tcPr>
+            <w:tcW w:type="dxa" w:w="1587"/>
+            <w:vAlign w:val="center"/>
+            <w:shd w:val="clear" w:fill="FFFFFF"/>
+          </w:tcPr>
+          <w:p>
+            <w:pPr>
+              <w:spacing w:before="40" w:after="0"/>
+              <w:jc w:val="center"/>
+            </w:pPr>
+            <w:r>
+              <w:rPr>
+                <w:b/>
+                <w:color w:val="1F5C31"/>
+                <w:sz w:val="13"/>
+                <w:shd w:val="clear" w:fill="E2F3E6"/>
+              </w:rPr>
+              <w:t xml:space="preserve"> Money IN — Receivable (AR) </w:t>
+            </w:r>
+          </w:p>
+          <w:p>
+            <w:pPr>
+              <w:spacing w:after="40"/>
+              <w:jc w:val="center"/>
+            </w:pPr>
+            <w:r>
+              <w:rPr>
+                <w:b/>
+                <w:color w:val="64748B"/>
+                <w:sz w:val="24"/>
+              </w:rPr>
+              <w:t>→</w:t>
+            </w:r>
+          </w:p>
+        </w:tc>
+        <w:tc>
+          <w:tcPr>
+            <w:tcW w:type="dxa" w:w="2948"/>
+            <w:shd w:val="clear" w:fill="F1F5F9"/>
+            <w:tcBorders>
+              <w:top w:val="single" w:sz="8" w:color="94A3B8"/>
+              <w:bottom w:val="single" w:sz="8" w:color="94A3B8"/>
+              <w:left w:val="single" w:sz="8" w:color="94A3B8"/>
+              <w:right w:val="single" w:sz="8" w:color="94A3B8"/>
+            </w:tcBorders>
+            <w:vAlign w:val="center"/>
+          </w:tcPr>
+          <w:p>
+            <w:pPr>
+              <w:spacing w:before="40" w:after="40"/>
+              <w:jc w:val="center"/>
+            </w:pPr>
+            <w:r>
+              <w:rPr>
+                <w:b/>
+                <w:color w:val="1E293B"/>
+                <w:sz w:val="15"/>
+              </w:rPr>
+              <w:t>Freight Tiger (marketplace)</w:t>
+            </w:r>
+            <w:r>
+              <w:rPr>
+                <w:b w:val="0"/>
+                <w:color w:val="334155"/>
+                <w:sz w:val="15"/>
+              </w:rPr>
+            </w:r>
+          </w:p>
+          <w:p>
+            <w:pPr>
+              <w:spacing w:before="0" w:after="40"/>
+              <w:jc w:val="center"/>
+            </w:pPr>
+            <w:r>
+              <w:rPr>
+                <w:b w:val="0"/>
+                <w:color w:val="334155"/>
+                <w:sz w:val="15"/>
+              </w:rPr>
+              <w:t>Sits in the middle — collects from LSP, pays FO, keeps the margin</w:t>
+            </w:r>
+          </w:p>
+        </w:tc>
+        <w:tc>
+          <w:tcPr>
+            <w:tcW w:type="dxa" w:w="1587"/>
+            <w:vAlign w:val="center"/>
+            <w:shd w:val="clear" w:fill="FFFFFF"/>
+          </w:tcPr>
+          <w:p>
+            <w:pPr>
+              <w:spacing w:before="40" w:after="0"/>
+              <w:jc w:val="center"/>
+            </w:pPr>
+            <w:r>
+              <w:rPr>
+                <w:b/>
+                <w:color w:val="7A3306"/>
+                <w:sz w:val="13"/>
+                <w:shd w:val="clear" w:fill="FDEBD7"/>
+              </w:rPr>
+              <w:t xml:space="preserve"> Money OUT — Payable (AP) </w:t>
+            </w:r>
+          </w:p>
+          <w:p>
+            <w:pPr>
+              <w:spacing w:after="40"/>
+              <w:jc w:val="center"/>
+            </w:pPr>
+            <w:r>
+              <w:rPr>
+                <w:b/>
+                <w:color w:val="64748B"/>
+                <w:sz w:val="24"/>
+              </w:rPr>
+              <w:t>→</w:t>
+            </w:r>
+          </w:p>
+        </w:tc>
+        <w:tc>
+          <w:tcPr>
+            <w:tcW w:type="dxa" w:w="2721"/>
+            <w:shd w:val="clear" w:fill="EAF2FB"/>
+            <w:tcBorders>
+              <w:top w:val="single" w:sz="8" w:color="6F9FD0"/>
+              <w:bottom w:val="single" w:sz="8" w:color="6F9FD0"/>
+              <w:left w:val="single" w:sz="8" w:color="6F9FD0"/>
+              <w:right w:val="single" w:sz="8" w:color="6F9FD0"/>
+            </w:tcBorders>
+            <w:vAlign w:val="center"/>
+          </w:tcPr>
+          <w:p>
+            <w:pPr>
+              <w:spacing w:before="40" w:after="40"/>
+              <w:jc w:val="center"/>
+            </w:pPr>
+            <w:r>
+              <w:rPr>
+                <w:b/>
+                <w:color w:val="1E293B"/>
+                <w:sz w:val="15"/>
+              </w:rPr>
+              <w:t>Fleet Owner (vendor)</w:t>
+            </w:r>
+            <w:r>
+              <w:rPr>
+                <w:b w:val="0"/>
+                <w:color w:val="334155"/>
+                <w:sz w:val="15"/>
+              </w:rPr>
+            </w:r>
+          </w:p>
+          <w:p>
+            <w:pPr>
+              <w:spacing w:before="0" w:after="40"/>
+              <w:jc w:val="center"/>
+            </w:pPr>
+            <w:r>
+              <w:rPr>
+                <w:b w:val="0"/>
+                <w:color w:val="334155"/>
+                <w:sz w:val="15"/>
+              </w:rPr>
+              <w:t>Runs the trip and is owed the payout</w:t>
+            </w:r>
+          </w:p>
+        </w:tc>
+      </w:tr>
+    </w:tbl>
+    <w:p>
+      <w:pPr>
+        <w:spacing w:before="40" w:after="80"/>
+        <w:jc w:val="center"/>
+      </w:pPr>
+      <w:r>
+        <w:rPr>
+          <w:i/>
+          <w:color w:val="64748B"/>
+          <w:sz w:val="15"/>
+        </w:rPr>
+        <w:t>Today both sides are mixed into the same trip fields — there is no separate “money in” (AR) vs “money out” (AP) view, so margin is invisible.</w:t>
       </w:r>
     </w:p>
     <w:tbl>
@@ -108,7 +362,7 @@
       <w:tr>
         <w:tc>
           <w:tcPr>
-            <w:tcW w:type="dxa" w:w="1814"/>
+            <w:tcW w:type="dxa" w:w="1871"/>
             <w:shd w:val="clear" w:fill="F1F5F9"/>
             <w:tcBorders>
               <w:top w:val="single" w:sz="8" w:color="94A3B8"/>
@@ -156,7 +410,7 @@
         </w:tc>
         <w:tc>
           <w:tcPr>
-            <w:tcW w:type="dxa" w:w="340"/>
+            <w:tcW w:type="dxa" w:w="283"/>
             <w:vAlign w:val="center"/>
           </w:tcPr>
           <w:p>
@@ -176,7 +430,7 @@
         </w:tc>
         <w:tc>
           <w:tcPr>
-            <w:tcW w:type="dxa" w:w="1928"/>
+            <w:tcW w:type="dxa" w:w="1984"/>
             <w:shd w:val="clear" w:fill="FEF2F2"/>
             <w:tcBorders>
               <w:top w:val="single" w:sz="8" w:color="EF9A9A"/>
@@ -218,13 +472,13 @@
                 <w:color w:val="334155"/>
                 <w:sz w:val="15"/>
               </w:rPr>
-              <w:t>Freight, charges, deductions — every edit overwrites the old value</w:t>
+              <w:t>Freight, charges, deductions — each edit overwrites the old value</w:t>
             </w:r>
           </w:p>
         </w:tc>
         <w:tc>
           <w:tcPr>
-            <w:tcW w:type="dxa" w:w="340"/>
+            <w:tcW w:type="dxa" w:w="283"/>
             <w:vAlign w:val="center"/>
           </w:tcPr>
           <w:p>
@@ -244,7 +498,7 @@
         </w:tc>
         <w:tc>
           <w:tcPr>
-            <w:tcW w:type="dxa" w:w="1928"/>
+            <w:tcW w:type="dxa" w:w="1984"/>
             <w:shd w:val="clear" w:fill="FEF2F2"/>
             <w:tcBorders>
               <w:top w:val="single" w:sz="8" w:color="EF9A9A"/>
@@ -286,13 +540,13 @@
                 <w:color w:val="334155"/>
                 <w:sz w:val="15"/>
               </w:rPr>
-              <w:t>One payment must match one charge; no part-payment, no wallet</w:t>
+              <w:t>One payment must match one charge; no part-payment or wallet</w:t>
             </w:r>
           </w:p>
         </w:tc>
         <w:tc>
           <w:tcPr>
-            <w:tcW w:type="dxa" w:w="340"/>
+            <w:tcW w:type="dxa" w:w="283"/>
             <w:vAlign w:val="center"/>
           </w:tcPr>
           <w:p>
@@ -312,7 +566,7 @@
         </w:tc>
         <w:tc>
           <w:tcPr>
-            <w:tcW w:type="dxa" w:w="1928"/>
+            <w:tcW w:type="dxa" w:w="1984"/>
             <w:shd w:val="clear" w:fill="FEF2F2"/>
             <w:tcBorders>
               <w:top w:val="single" w:sz="8" w:color="EF9A9A"/>
@@ -333,7 +587,7 @@
                 <w:color w:val="1E293B"/>
                 <w:sz w:val="15"/>
               </w:rPr>
-              <w:t>Finance fixes it by hand</w:t>
+              <w:t>Finance cleans up manually</w:t>
             </w:r>
             <w:r>
               <w:rPr>
@@ -354,13 +608,13 @@
                 <w:color w:val="334155"/>
                 <w:sz w:val="15"/>
               </w:rPr>
-              <w:t>Spreadsheet reconciliation, manual Bill of Supply, TDS &amp; recoveries</w:t>
+              <w:t>Payments matched to trips in spreadsheets; Bill of Supply &amp; TDS by hand</w:t>
             </w:r>
           </w:p>
         </w:tc>
         <w:tc>
           <w:tcPr>
-            <w:tcW w:type="dxa" w:w="340"/>
+            <w:tcW w:type="dxa" w:w="283"/>
             <w:vAlign w:val="center"/>
           </w:tcPr>
           <w:p>
@@ -380,7 +634,7 @@
         </w:tc>
         <w:tc>
           <w:tcPr>
-            <w:tcW w:type="dxa" w:w="1814"/>
+            <w:tcW w:type="dxa" w:w="1871"/>
             <w:shd w:val="clear" w:fill="F1F5F9"/>
             <w:tcBorders>
               <w:top w:val="single" w:sz="8" w:color="94A3B8"/>
@@ -422,7 +676,7 @@
                 <w:color w:val="334155"/>
                 <w:sz w:val="15"/>
               </w:rPr>
-              <w:t>Metabase data corrected before anyone can use it</w:t>
+              <w:t>Metabase data corrected before use</w:t>
             </w:r>
           </w:p>
         </w:tc>
@@ -489,7 +743,7 @@
     </w:tbl>
     <w:p>
       <w:pPr>
-        <w:spacing w:before="200" w:after="80"/>
+        <w:spacing w:before="140" w:after="80"/>
         <w:pBdr>
           <w:bottom w:val="single" w:sz="8" w:color="E2E8F0"/>
         </w:pBdr>
@@ -749,7 +1003,7 @@
     </w:tbl>
     <w:p>
       <w:pPr>
-        <w:spacing w:before="200" w:after="80"/>
+        <w:spacing w:before="140" w:after="80"/>
         <w:pBdr>
           <w:bottom w:val="single" w:sz="8" w:color="E2E8F0"/>
         </w:pBdr>
@@ -1323,7 +1577,7 @@
                 <w:color w:val="FFFFFF"/>
                 <w:sz w:val="17"/>
               </w:rPr>
-              <w:t>defensible balances on any date  •  automated compliance  •  500+ finance hours/month back  •  ledger visible to FOs &amp; LSPs later for trust</w:t>
+              <w:t>defensible balances on any date  •  automated compliance  •  500+ finance hours/month back  •  ledger visible to FOs &amp; LSPs</w:t>
             </w:r>
           </w:p>
         </w:tc>
@@ -1336,7 +1590,7 @@
     </w:p>
     <w:p>
       <w:pPr>
-        <w:spacing w:before="200" w:after="80"/>
+        <w:spacing w:before="140" w:after="80"/>
         <w:pBdr>
           <w:bottom w:val="single" w:sz="8" w:color="E2E8F0"/>
         </w:pBdr>

</xml_diff>

<commit_message>
Clarify wallet scope: basic internal ledger balance only, no external integration
https://claude.ai/code/session_01QzNXqs3AZVba53uzCJorjC
</commit_message>
<xml_diff>
--- a/Ledger_Build_vs_Buy.docx
+++ b/Ledger_Build_vs_Buy.docx
@@ -1526,12 +1526,42 @@
     </w:tbl>
     <w:p>
       <w:pPr>
-        <w:spacing w:after="40"/>
+        <w:spacing w:before="40" w:after="60"/>
+        <w:jc w:val="center"/>
       </w:pPr>
       <w:r>
         <w:rPr>
-          <w:sz w:val="4"/>
+          <w:b/>
+          <w:i/>
+          <w:color w:val="64748B"/>
+          <w:sz w:val="15"/>
         </w:rPr>
+        <w:t xml:space="preserve">Scope note on “wallet”: </w:t>
+      </w:r>
+      <w:r>
+        <w:rPr>
+          <w:i/>
+          <w:color w:val="64748B"/>
+          <w:sz w:val="15"/>
+        </w:rPr>
+        <w:t xml:space="preserve">this is only a basic internal balance in our ledger — to track overpayments, credits/debits and cross-trip settlement. We are </w:t>
+      </w:r>
+      <w:r>
+        <w:rPr>
+          <w:b/>
+          <w:i/>
+          <w:color w:val="64748B"/>
+          <w:sz w:val="15"/>
+        </w:rPr>
+        <w:t>not</w:t>
+      </w:r>
+      <w:r>
+        <w:rPr>
+          <w:i/>
+          <w:color w:val="64748B"/>
+          <w:sz w:val="15"/>
+        </w:rPr>
+        <w:t xml:space="preserve"> building a full-fledged wallet product: no money is stored and there is no external wallet integration.</w:t>
       </w:r>
     </w:p>
     <w:tbl>
@@ -1864,7 +1894,7 @@
                 <w:color w:val="1E293B"/>
                 <w:sz w:val="16"/>
               </w:rPr>
-              <w:t>Native wallets for FOs and LSPs; one payment can cover many charges or be part-paid.</w:t>
+              <w:t>Basic internal wallet for FOs and LSPs — a ledger balance for overpayments, credits and cross-trip settlement only (not a full wallet product; no external integration). One payment can cover many charges or be part-paid.</w:t>
             </w:r>
           </w:p>
         </w:tc>
@@ -2561,7 +2591,7 @@
               <w:rPr>
                 <w:sz w:val="17"/>
               </w:rPr>
-              <w:t>Every financial change is stored as a new entry (never overwritten), giving us defensible point-in-time balances, flexible settlement with wallets, a clean receivable/payable and margin view per party, and automated Bill of Supply, credit notes and TDS. If statutory books are required, we sync summarised entries to Zoho downstream rather than running it as the live system.</w:t>
+              <w:t>Every financial change is stored as a new entry (never overwritten), giving us defensible point-in-time balances, flexible settlement with basic internal wallets (ledger balances only — not a full wallet product), a clean receivable/payable and margin view per party, and automated Bill of Supply, credit notes and TDS. If statutory books are required, we sync summarised entries to Zoho downstream rather than running it as the live system.</w:t>
             </w:r>
           </w:p>
           <w:p>

</xml_diff>